<commit_message>
Restructure data formatting files
</commit_message>
<xml_diff>
--- a/src/pto_template.docx
+++ b/src/pto_template.docx
@@ -91,12 +91,48 @@
       <w:tr>
         <w:tc>
           <w:tcPr>
+            <w:tcW w:type="dxa" w:w="1728"/>
+          </w:tcPr>
+          <w:p>
+            <w:r>
+              <w:t>{%tr for group in taxon_groups %}</w:t>
+            </w:r>
+          </w:p>
+        </w:tc>
+        <w:tc>
+          <w:tcPr>
+            <w:tcW w:type="dxa" w:w="1728"/>
+          </w:tcPr>
+          <w:p/>
+        </w:tc>
+        <w:tc>
+          <w:tcPr>
+            <w:tcW w:type="dxa" w:w="1728"/>
+          </w:tcPr>
+          <w:p/>
+        </w:tc>
+        <w:tc>
+          <w:tcPr>
+            <w:tcW w:type="dxa" w:w="1728"/>
+          </w:tcPr>
+          <w:p/>
+        </w:tc>
+        <w:tc>
+          <w:tcPr>
+            <w:tcW w:type="dxa" w:w="1728"/>
+          </w:tcPr>
+          <w:p/>
+        </w:tc>
+      </w:tr>
+      <w:tr>
+        <w:tc>
+          <w:tcPr>
             <w:tcW w:type="dxa" w:w="8640"/>
             <w:gridSpan w:val="5"/>
           </w:tcPr>
           <w:p>
             <w:r>
-              <w:t>CNPS Species</w:t>
+              <w:t>{{ group.TaxonGroup }}</w:t>
             </w:r>
           </w:p>
         </w:tc>
@@ -108,7 +144,7 @@
           </w:tcPr>
           <w:p>
             <w:r>
-              <w:t>{%tr for row in cnps_rows %}</w:t>
+              <w:t>{%tr for row in group.rows %}</w:t>
             </w:r>
           </w:p>
         </w:tc>
@@ -228,118 +264,6 @@
       <w:tr>
         <w:tc>
           <w:tcPr>
-            <w:tcW w:type="dxa" w:w="8640"/>
-            <w:gridSpan w:val="5"/>
-          </w:tcPr>
-          <w:p>
-            <w:r/>
-          </w:p>
-        </w:tc>
-      </w:tr>
-      <w:tr>
-        <w:tc>
-          <w:tcPr>
-            <w:tcW w:type="dxa" w:w="8640"/>
-            <w:gridSpan w:val="5"/>
-          </w:tcPr>
-          <w:p>
-            <w:r>
-              <w:t>CNDDB Species</w:t>
-            </w:r>
-          </w:p>
-        </w:tc>
-      </w:tr>
-      <w:tr>
-        <w:tc>
-          <w:tcPr>
-            <w:tcW w:type="dxa" w:w="1728"/>
-          </w:tcPr>
-          <w:p>
-            <w:r>
-              <w:t>{%tr for row in cnddb_rows %}</w:t>
-            </w:r>
-          </w:p>
-        </w:tc>
-        <w:tc>
-          <w:tcPr>
-            <w:tcW w:type="dxa" w:w="1728"/>
-          </w:tcPr>
-          <w:p/>
-        </w:tc>
-        <w:tc>
-          <w:tcPr>
-            <w:tcW w:type="dxa" w:w="1728"/>
-          </w:tcPr>
-          <w:p/>
-        </w:tc>
-        <w:tc>
-          <w:tcPr>
-            <w:tcW w:type="dxa" w:w="1728"/>
-          </w:tcPr>
-          <w:p/>
-        </w:tc>
-        <w:tc>
-          <w:tcPr>
-            <w:tcW w:type="dxa" w:w="1728"/>
-          </w:tcPr>
-          <w:p/>
-        </w:tc>
-      </w:tr>
-      <w:tr>
-        <w:tc>
-          <w:tcPr>
-            <w:tcW w:type="dxa" w:w="1728"/>
-          </w:tcPr>
-          <w:p>
-            <w:r>
-              <w:t>{{ row.SpeciesDisplay }}</w:t>
-            </w:r>
-          </w:p>
-        </w:tc>
-        <w:tc>
-          <w:tcPr>
-            <w:tcW w:type="dxa" w:w="1728"/>
-          </w:tcPr>
-          <w:p>
-            <w:r>
-              <w:t>{{ row.StatusDisplay }}</w:t>
-            </w:r>
-          </w:p>
-        </w:tc>
-        <w:tc>
-          <w:tcPr>
-            <w:tcW w:type="dxa" w:w="1728"/>
-          </w:tcPr>
-          <w:p>
-            <w:r>
-              <w:t>{{ row.HabitatRequirements }}</w:t>
-            </w:r>
-          </w:p>
-        </w:tc>
-        <w:tc>
-          <w:tcPr>
-            <w:tcW w:type="dxa" w:w="1728"/>
-          </w:tcPr>
-          <w:p>
-            <w:r>
-              <w:t>{{ row.PotentialtoOccur }}</w:t>
-            </w:r>
-          </w:p>
-        </w:tc>
-        <w:tc>
-          <w:tcPr>
-            <w:tcW w:type="dxa" w:w="1728"/>
-          </w:tcPr>
-          <w:p>
-            <w:r>
-              <w:t>{{ row.HabitatSuitabilityObservations }}</w:t>
-            </w:r>
-          </w:p>
-        </w:tc>
-      </w:tr>
-      <w:tr>
-        <w:tc>
-          <w:tcPr>
             <w:tcW w:type="dxa" w:w="1728"/>
           </w:tcPr>
           <w:p>
@@ -371,17 +295,6 @@
             <w:tcW w:type="dxa" w:w="1728"/>
           </w:tcPr>
           <w:p/>
-        </w:tc>
-      </w:tr>
-      <w:tr>
-        <w:tc>
-          <w:tcPr>
-            <w:tcW w:type="dxa" w:w="8640"/>
-            <w:gridSpan w:val="5"/>
-          </w:tcPr>
-          <w:p>
-            <w:r/>
-          </w:p>
         </w:tc>
       </w:tr>
     </w:tbl>

</xml_diff>